<commit_message>
Switch newsletter endpoint to second Google account
</commit_message>
<xml_diff>
--- a/Nexdo_Handover_Document.docx
+++ b/Nexdo_Handover_Document.docx
@@ -110,12 +110,14 @@
     <w:p>
       <w:pPr>
         <w:rPr>
-          <w:lang w:val="en-UG"/>
+          <w:b/>
+          <w:bCs/>
         </w:rPr>
       </w:pPr>
       <w:r>
         <w:rPr>
-          <w:lang w:val="en-UG"/>
+          <w:b/>
+          <w:bCs/>
         </w:rPr>
         <w:t>How to log in to the admin panel:</w:t>
       </w:r>
@@ -126,37 +128,16 @@
           <w:ilvl w:val="0"/>
           <w:numId w:val="1"/>
         </w:numPr>
-        <w:rPr>
-          <w:lang w:val="en-UG"/>
-        </w:rPr>
-      </w:pPr>
-      <w:r>
-        <w:rPr>
-          <w:lang w:val="en-UG"/>
-        </w:rPr>
+      </w:pPr>
+      <w:r>
         <w:t>Go to </w:t>
       </w:r>
       <w:hyperlink r:id="rId5" w:tgtFrame="_blank" w:history="1">
         <w:r>
           <w:rPr>
             <w:rStyle w:val="Hyperlink"/>
-            <w:lang w:val="en-UG"/>
           </w:rPr>
-          <w:t>https://nexdoadvent</w:t>
-        </w:r>
-        <w:r>
-          <w:rPr>
-            <w:rStyle w:val="Hyperlink"/>
-            <w:lang w:val="en-UG"/>
-          </w:rPr>
-          <w:t>o</w:t>
-        </w:r>
-        <w:r>
-          <w:rPr>
-            <w:rStyle w:val="Hyperlink"/>
-            <w:lang w:val="en-UG"/>
-          </w:rPr>
-          <w:t>urs.com/admin/</w:t>
+          <w:t>https://nexdoadventours.com/admin/</w:t>
         </w:r>
       </w:hyperlink>
     </w:p>
@@ -166,14 +147,8 @@
           <w:ilvl w:val="0"/>
           <w:numId w:val="1"/>
         </w:numPr>
-        <w:rPr>
-          <w:lang w:val="en-UG"/>
-        </w:rPr>
-      </w:pPr>
-      <w:r>
-        <w:rPr>
-          <w:lang w:val="en-UG"/>
-        </w:rPr>
+      </w:pPr>
+      <w:r>
         <w:t>Click "Login with Netlify Identity"</w:t>
       </w:r>
     </w:p>
@@ -183,14 +158,8 @@
           <w:ilvl w:val="0"/>
           <w:numId w:val="1"/>
         </w:numPr>
-        <w:rPr>
-          <w:lang w:val="en-UG"/>
-        </w:rPr>
-      </w:pPr>
-      <w:r>
-        <w:rPr>
-          <w:lang w:val="en-UG"/>
-        </w:rPr>
+      </w:pPr>
+      <w:r>
         <w:t>A GitHub login page will open — click "Authorize Netlify"</w:t>
       </w:r>
     </w:p>
@@ -200,27 +169,13 @@
           <w:ilvl w:val="0"/>
           <w:numId w:val="1"/>
         </w:numPr>
-        <w:rPr>
-          <w:lang w:val="en-UG"/>
-        </w:rPr>
-      </w:pPr>
-      <w:r>
-        <w:rPr>
-          <w:lang w:val="en-UG"/>
-        </w:rPr>
+      </w:pPr>
+      <w:r>
         <w:t>You're in. You can now edit: Site Settings, Blog Posts, Gallery, Reviews, FAQs</w:t>
       </w:r>
     </w:p>
     <w:p>
-      <w:pPr>
-        <w:rPr>
-          <w:lang w:val="en-UG"/>
-        </w:rPr>
-      </w:pPr>
-      <w:r>
-        <w:rPr>
-          <w:lang w:val="en-UG"/>
-        </w:rPr>
+      <w:r>
         <w:t>That's it. No username/password — it uses the GitHub account you already have.</w:t>
       </w:r>
     </w:p>
@@ -289,7 +244,17 @@
             </w:tcBorders>
           </w:tcPr>
           <w:p>
-            <w:r>
+            <w:pPr>
+              <w:rPr>
+                <w:b/>
+                <w:bCs/>
+              </w:rPr>
+            </w:pPr>
+            <w:r>
+              <w:rPr>
+                <w:b/>
+                <w:bCs/>
+              </w:rPr>
               <w:t>GitHub</w:t>
             </w:r>
           </w:p>
@@ -379,7 +344,17 @@
             </w:tcBorders>
           </w:tcPr>
           <w:p>
-            <w:r>
+            <w:pPr>
+              <w:rPr>
+                <w:b/>
+                <w:bCs/>
+              </w:rPr>
+            </w:pPr>
+            <w:r>
+              <w:rPr>
+                <w:b/>
+                <w:bCs/>
+              </w:rPr>
               <w:lastRenderedPageBreak/>
               <w:t>Netlify</w:t>
             </w:r>
@@ -465,7 +440,17 @@
             </w:tcBorders>
           </w:tcPr>
           <w:p>
-            <w:r>
+            <w:pPr>
+              <w:rPr>
+                <w:b/>
+                <w:bCs/>
+              </w:rPr>
+            </w:pPr>
+            <w:r>
+              <w:rPr>
+                <w:b/>
+                <w:bCs/>
+              </w:rPr>
               <w:t>FormSubmit.co</w:t>
             </w:r>
           </w:p>
@@ -515,7 +500,17 @@
             </w:tcBorders>
           </w:tcPr>
           <w:p>
-            <w:r>
+            <w:pPr>
+              <w:rPr>
+                <w:b/>
+                <w:bCs/>
+              </w:rPr>
+            </w:pPr>
+            <w:r>
+              <w:rPr>
+                <w:b/>
+                <w:bCs/>
+              </w:rPr>
               <w:t>Google Apps Script</w:t>
             </w:r>
           </w:p>
@@ -552,14 +547,13 @@
                 <w:rPr>
                   <w:rStyle w:val="Hyperlink"/>
                 </w:rPr>
-                <w:t>https://docs.google.com/spreadsheets/d/1qH8veHIcF17PZa1P0G3u521z3MKPNK_Ov7DAlSjfngc/edit?usp=sharing</w:t>
+                <w:t>https://script.google.com/d/1cGOKyz7Hu3mCKVEzdTTfQZQX2gkVMwJxvyhmXv4MLjP6EMrTsYa8GQlV/edit?usp=sharing</w:t>
               </w:r>
             </w:hyperlink>
             <w:r>
-              <w:t xml:space="preserve">. </w:t>
+              <w:t xml:space="preserve"> </w:t>
             </w:r>
           </w:p>
-          <w:p/>
         </w:tc>
       </w:tr>
     </w:tbl>
@@ -1307,6 +1301,7 @@
   <w:style w:type="character" w:default="1" w:styleId="DefaultParagraphFont">
     <w:name w:val="Default Paragraph Font"/>
     <w:uiPriority w:val="1"/>
+    <w:semiHidden/>
     <w:unhideWhenUsed/>
   </w:style>
   <w:style w:type="table" w:default="1" w:styleId="TableNormal">

</xml_diff>